<commit_message>
Tighten CV: drop Tailwind, Framer Motion, 3D, MongoDB
Remove anything we don't actually work with, plus any wording that
reads as a specific semester or capstone marker:

- Skills: drop TailwindCSS, Framer Motion, the '3D & Interaction' line,
  and the Databases line
- Nex Studio: drop Three.js and parallax mentions from the stack,
  description, and first bullet
- Education: 'Current: Semester 2' -> 'Current: In view'
- PlayfulOutings + Achievements: remove 'Semester 1 eProject at Aptech'
  wording

Backend line kept (Node.js/Express/REST/JWT, in progress).

Co-Authored-By: Claude Opus 4.8 <noreply@anthropic.com>
</commit_message>
<xml_diff>
--- a/Daniel_Fortune_Ofu-Owoicho_CV.docx
+++ b/Daniel_Fortune_Ofu-Owoicho_CV.docx
@@ -188,7 +188,7 @@
           <w:sz w:val="22"/>
           <w:szCs w:val="22"/>
         </w:rPr>
-        <w:t xml:space="preserve">React, Next.js, Vite, React Native (Expo), HTML5, CSS3, JavaScript (ES6+), TailwindCSS, Framer Motion</w:t>
+        <w:t xml:space="preserve">React, Next.js, Vite, React Native (Expo), HTML5, CSS3, JavaScript (ES6+)</w:t>
       </w:r>
     </w:p>
     <w:p>
@@ -207,7 +207,7 @@
           <w:sz w:val="22"/>
           <w:szCs w:val="22"/>
         </w:rPr>
-        <w:t xml:space="preserve">3D &amp; Interaction:</w:t>
+        <w:t xml:space="preserve">Backend (in progress):</w:t>
       </w:r>
       <w:r>
         <w:rPr>
@@ -222,7 +222,7 @@
           <w:sz w:val="22"/>
           <w:szCs w:val="22"/>
         </w:rPr>
-        <w:t xml:space="preserve">Three.js, React Three Fiber, Framer Motion, smooth-scroll &amp; parallax effects</w:t>
+        <w:t xml:space="preserve">Node.js, Express.js, REST APIs, JWT authentication</w:t>
       </w:r>
     </w:p>
     <w:p>
@@ -241,7 +241,7 @@
           <w:sz w:val="22"/>
           <w:szCs w:val="22"/>
         </w:rPr>
-        <w:t xml:space="preserve">Backend (in progress):</w:t>
+        <w:t xml:space="preserve">Programming Languages:</w:t>
       </w:r>
       <w:r>
         <w:rPr>
@@ -256,75 +256,7 @@
           <w:sz w:val="22"/>
           <w:szCs w:val="22"/>
         </w:rPr>
-        <w:t xml:space="preserve">Node.js, Express.js, REST APIs, JWT authentication</w:t>
-      </w:r>
-    </w:p>
-    <w:p>
-      <w:pPr>
-        <w:tabs>
-          <w:tab w:val="left" w:pos="1700"/>
-        </w:tabs>
-        <w:spacing w:after="60"/>
-      </w:pPr>
-      <w:r>
-        <w:rPr>
-          <w:rFonts w:ascii="Calibri" w:cs="Calibri" w:eastAsia="Calibri" w:hAnsi="Calibri"/>
-          <w:b/>
-          <w:bCs/>
-          <w:color w:val="111827"/>
-          <w:sz w:val="22"/>
-          <w:szCs w:val="22"/>
-        </w:rPr>
-        <w:t xml:space="preserve">Programming Languages:</w:t>
-      </w:r>
-      <w:r>
-        <w:rPr>
-          <w:rFonts w:ascii="Calibri" w:cs="Calibri" w:eastAsia="Calibri" w:hAnsi="Calibri"/>
-        </w:rPr>
-        <w:t xml:space="preserve">  </w:t>
-      </w:r>
-      <w:r>
-        <w:rPr>
-          <w:rFonts w:ascii="Calibri" w:cs="Calibri" w:eastAsia="Calibri" w:hAnsi="Calibri"/>
-          <w:color w:val="111827"/>
-          <w:sz w:val="22"/>
-          <w:szCs w:val="22"/>
-        </w:rPr>
         <w:t xml:space="preserve">JavaScript, Java</w:t>
-      </w:r>
-    </w:p>
-    <w:p>
-      <w:pPr>
-        <w:tabs>
-          <w:tab w:val="left" w:pos="1700"/>
-        </w:tabs>
-        <w:spacing w:after="60"/>
-      </w:pPr>
-      <w:r>
-        <w:rPr>
-          <w:rFonts w:ascii="Calibri" w:cs="Calibri" w:eastAsia="Calibri" w:hAnsi="Calibri"/>
-          <w:b/>
-          <w:bCs/>
-          <w:color w:val="111827"/>
-          <w:sz w:val="22"/>
-          <w:szCs w:val="22"/>
-        </w:rPr>
-        <w:t xml:space="preserve">Databases:</w:t>
-      </w:r>
-      <w:r>
-        <w:rPr>
-          <w:rFonts w:ascii="Calibri" w:cs="Calibri" w:eastAsia="Calibri" w:hAnsi="Calibri"/>
-        </w:rPr>
-        <w:t xml:space="preserve">  </w:t>
-      </w:r>
-      <w:r>
-        <w:rPr>
-          <w:rFonts w:ascii="Calibri" w:cs="Calibri" w:eastAsia="Calibri" w:hAnsi="Calibri"/>
-          <w:color w:val="111827"/>
-          <w:sz w:val="22"/>
-          <w:szCs w:val="22"/>
-        </w:rPr>
-        <w:t xml:space="preserve">MongoDB, SQL (foundational)</w:t>
       </w:r>
     </w:p>
     <w:p>
@@ -448,7 +380,7 @@
           <w:sz w:val="20"/>
           <w:szCs w:val="20"/>
         </w:rPr>
-        <w:t xml:space="preserve">Next.js 14, TypeScript, Three.js, Framer Motion, Prisma</w:t>
+        <w:t xml:space="preserve">Next.js 14, TypeScript, Prisma</w:t>
       </w:r>
     </w:p>
     <w:p>
@@ -462,7 +394,7 @@
           <w:sz w:val="21"/>
           <w:szCs w:val="21"/>
         </w:rPr>
-        <w:t xml:space="preserve">Full-stack marketing site for a creative studio. Features a Three.js hero scene, mouse-parallax effects, smooth cinematic scroll, full authentication, a role-based admin dashboard, and a content management system for gallery, testimonials, contact submissions, and newsletter subscribers.</w:t>
+        <w:t xml:space="preserve">Full-stack marketing site for a creative studio. Features smooth cinematic scroll, full authentication, a role-based admin dashboard, and a content management system for gallery, testimonials, contact submissions, and newsletter subscribers.</w:t>
       </w:r>
     </w:p>
     <w:p>
@@ -483,29 +415,7 @@
           <w:sz w:val="22"/>
           <w:szCs w:val="22"/>
         </w:rPr>
-        <w:t xml:space="preserve">Built a 3D hero scene with </w:t>
-      </w:r>
-      <w:r>
-        <w:rPr>
-          <w:rFonts w:ascii="Calibri" w:cs="Calibri" w:eastAsia="Calibri" w:hAnsi="Calibri"/>
-          <w:b/>
-          <w:bCs/>
-          <w:color w:val="111827"/>
-          <w:sz w:val="22"/>
-          <w:szCs w:val="22"/>
-        </w:rPr>
-        <w:t xml:space="preserve">Three.js</w:t>
-      </w:r>
-      <w:r>
-        <w:rPr>
-          <w:rFonts w:ascii="Calibri" w:cs="Calibri" w:eastAsia="Calibri" w:hAnsi="Calibri"/>
-          <w:b w:val="false"/>
-          <w:bCs w:val="false"/>
-          <w:color w:val="111827"/>
-          <w:sz w:val="22"/>
-          <w:szCs w:val="22"/>
-        </w:rPr>
-        <w:t xml:space="preserve"> and parallax-driven UI for an immersive first impression.</w:t>
+        <w:t xml:space="preserve">Built the marketing site with a smooth, cinematic scroll experience and a polished, content-driven UI.</w:t>
       </w:r>
     </w:p>
     <w:p>
@@ -688,7 +598,7 @@
           <w:sz w:val="22"/>
           <w:szCs w:val="22"/>
         </w:rPr>
-        <w:t xml:space="preserve"> as a Semester 1 eProject at Aptech.</w:t>
+        <w:t xml:space="preserve">.</w:t>
       </w:r>
     </w:p>
     <w:p>
@@ -1112,7 +1022,7 @@
           <w:sz w:val="22"/>
           <w:szCs w:val="22"/>
         </w:rPr>
-        <w:t xml:space="preserve">Current: Semester 2</w:t>
+        <w:t xml:space="preserve">Current: In view</w:t>
       </w:r>
     </w:p>
     <w:p>
@@ -1281,27 +1191,6 @@
           <w:szCs w:val="22"/>
         </w:rPr>
         <w:t xml:space="preserve">Built a portfolio of full-stack web projects and Java-based software on GitHub.</w:t>
-      </w:r>
-    </w:p>
-    <w:p>
-      <w:pPr>
-        <w:pStyle w:val="ListParagraph"/>
-        <w:numPr>
-          <w:ilvl w:val="0"/>
-          <w:numId w:val="1"/>
-        </w:numPr>
-        <w:spacing w:after="60"/>
-      </w:pPr>
-      <w:r>
-        <w:rPr>
-          <w:rFonts w:ascii="Calibri" w:cs="Calibri" w:eastAsia="Calibri" w:hAnsi="Calibri"/>
-          <w:b w:val="false"/>
-          <w:bCs w:val="false"/>
-          <w:color w:val="111827"/>
-          <w:sz w:val="22"/>
-          <w:szCs w:val="22"/>
-        </w:rPr>
-        <w:t xml:space="preserve">Completed the Semester 1 eProject at Aptech as a collaborative, end-to-end shipped product.</w:t>
       </w:r>
     </w:p>
     <w:sectPr>

</xml_diff>

<commit_message>
CV: point ATM entry at the new atm-console-app repo
Replace the placeholder 'atm-system' link with the real repo URL
(github.com/fortunerohi27-crypto/-atm-console-app) and refresh the
description and bullets to match what was actually built: multi-class
OOP (Account / Bank / Transaction), file persistence, atomic transfer
with rollback, and two-layer input validation.

Co-Authored-By: Claude Opus 4.8 <noreply@anthropic.com>
</commit_message>
<xml_diff>
--- a/Daniel_Fortune_Ofu-Owoicho_CV.docx
+++ b/Daniel_Fortune_Ofu-Owoicho_CV.docx
@@ -864,7 +864,7 @@
           <w:sz w:val="20"/>
           <w:szCs w:val="20"/>
         </w:rPr>
-        <w:t xml:space="preserve">Java, OOP</w:t>
+        <w:t xml:space="preserve">Java, OOP, File I/O</w:t>
       </w:r>
     </w:p>
     <w:p>
@@ -878,7 +878,7 @@
           <w:sz w:val="21"/>
           <w:szCs w:val="21"/>
         </w:rPr>
-        <w:t xml:space="preserve">Java console application simulating core ATM operations, including deposits, withdrawals, balance inquiries, transaction history, and exit flow.</w:t>
+        <w:t xml:space="preserve">Java console ATM with login, balance, deposit, withdraw, transfer, and bounded transaction history. State is persisted to disk after every mutating action; PINs are stored as hashes, not plaintext.</w:t>
       </w:r>
     </w:p>
     <w:p>
@@ -899,29 +899,73 @@
           <w:sz w:val="22"/>
           <w:szCs w:val="22"/>
         </w:rPr>
-        <w:t xml:space="preserve">Applied </w:t>
-      </w:r>
-      <w:r>
-        <w:rPr>
-          <w:rFonts w:ascii="Calibri" w:cs="Calibri" w:eastAsia="Calibri" w:hAnsi="Calibri"/>
-          <w:b/>
-          <w:bCs/>
-          <w:color w:val="111827"/>
-          <w:sz w:val="22"/>
-          <w:szCs w:val="22"/>
-        </w:rPr>
-        <w:t xml:space="preserve">object-oriented principles</w:t>
-      </w:r>
-      <w:r>
-        <w:rPr>
-          <w:rFonts w:ascii="Calibri" w:cs="Calibri" w:eastAsia="Calibri" w:hAnsi="Calibri"/>
-          <w:b w:val="false"/>
-          <w:bCs w:val="false"/>
-          <w:color w:val="111827"/>
-          <w:sz w:val="22"/>
-          <w:szCs w:val="22"/>
-        </w:rPr>
-        <w:t xml:space="preserve">, conditional logic, loops, methods, and input validation for accurate transaction handling.</w:t>
+        <w:t xml:space="preserve">Modelled the domain as </w:t>
+      </w:r>
+      <w:r>
+        <w:rPr>
+          <w:rFonts w:ascii="Calibri" w:cs="Calibri" w:eastAsia="Calibri" w:hAnsi="Calibri"/>
+          <w:b/>
+          <w:bCs/>
+          <w:color w:val="111827"/>
+          <w:sz w:val="22"/>
+          <w:szCs w:val="22"/>
+        </w:rPr>
+        <w:t xml:space="preserve">Account</w:t>
+      </w:r>
+      <w:r>
+        <w:rPr>
+          <w:rFonts w:ascii="Calibri" w:cs="Calibri" w:eastAsia="Calibri" w:hAnsi="Calibri"/>
+          <w:b w:val="false"/>
+          <w:bCs w:val="false"/>
+          <w:color w:val="111827"/>
+          <w:sz w:val="22"/>
+          <w:szCs w:val="22"/>
+        </w:rPr>
+        <w:t xml:space="preserve">, </w:t>
+      </w:r>
+      <w:r>
+        <w:rPr>
+          <w:rFonts w:ascii="Calibri" w:cs="Calibri" w:eastAsia="Calibri" w:hAnsi="Calibri"/>
+          <w:b/>
+          <w:bCs/>
+          <w:color w:val="111827"/>
+          <w:sz w:val="22"/>
+          <w:szCs w:val="22"/>
+        </w:rPr>
+        <w:t xml:space="preserve">Bank</w:t>
+      </w:r>
+      <w:r>
+        <w:rPr>
+          <w:rFonts w:ascii="Calibri" w:cs="Calibri" w:eastAsia="Calibri" w:hAnsi="Calibri"/>
+          <w:b w:val="false"/>
+          <w:bCs w:val="false"/>
+          <w:color w:val="111827"/>
+          <w:sz w:val="22"/>
+          <w:szCs w:val="22"/>
+        </w:rPr>
+        <w:t xml:space="preserve">, and </w:t>
+      </w:r>
+      <w:r>
+        <w:rPr>
+          <w:rFonts w:ascii="Calibri" w:cs="Calibri" w:eastAsia="Calibri" w:hAnsi="Calibri"/>
+          <w:b/>
+          <w:bCs/>
+          <w:color w:val="111827"/>
+          <w:sz w:val="22"/>
+          <w:szCs w:val="22"/>
+        </w:rPr>
+        <w:t xml:space="preserve">Transaction</w:t>
+      </w:r>
+      <w:r>
+        <w:rPr>
+          <w:rFonts w:ascii="Calibri" w:cs="Calibri" w:eastAsia="Calibri" w:hAnsi="Calibri"/>
+          <w:b w:val="false"/>
+          <w:bCs w:val="false"/>
+          <w:color w:val="111827"/>
+          <w:sz w:val="22"/>
+          <w:szCs w:val="22"/>
+        </w:rPr>
+        <w:t xml:space="preserve"> classes with clear separation of I/O, validation, and business logic.</w:t>
       </w:r>
     </w:p>
     <w:p>
@@ -942,7 +986,72 @@
           <w:sz w:val="22"/>
           <w:szCs w:val="22"/>
         </w:rPr>
-        <w:t xml:space="preserve">Implemented a bounded transaction history buffer and user input validation for safe account operations.</w:t>
+        <w:t xml:space="preserve">Implemented </w:t>
+      </w:r>
+      <w:r>
+        <w:rPr>
+          <w:rFonts w:ascii="Calibri" w:cs="Calibri" w:eastAsia="Calibri" w:hAnsi="Calibri"/>
+          <w:b/>
+          <w:bCs/>
+          <w:color w:val="111827"/>
+          <w:sz w:val="22"/>
+          <w:szCs w:val="22"/>
+        </w:rPr>
+        <w:t xml:space="preserve">file persistence</w:t>
+      </w:r>
+      <w:r>
+        <w:rPr>
+          <w:rFonts w:ascii="Calibri" w:cs="Calibri" w:eastAsia="Calibri" w:hAnsi="Calibri"/>
+          <w:b w:val="false"/>
+          <w:bCs w:val="false"/>
+          <w:color w:val="111827"/>
+          <w:sz w:val="22"/>
+          <w:szCs w:val="22"/>
+        </w:rPr>
+        <w:t xml:space="preserve"> (Java serialization) so balances and history survive a restart, plus an atomic transfer with rollback on failure.</w:t>
+      </w:r>
+    </w:p>
+    <w:p>
+      <w:pPr>
+        <w:pStyle w:val="ListParagraph"/>
+        <w:numPr>
+          <w:ilvl w:val="0"/>
+          <w:numId w:val="1"/>
+        </w:numPr>
+        <w:spacing w:after="60"/>
+      </w:pPr>
+      <w:r>
+        <w:rPr>
+          <w:rFonts w:ascii="Calibri" w:cs="Calibri" w:eastAsia="Calibri" w:hAnsi="Calibri"/>
+          <w:b w:val="false"/>
+          <w:bCs w:val="false"/>
+          <w:color w:val="111827"/>
+          <w:sz w:val="22"/>
+          <w:szCs w:val="22"/>
+        </w:rPr>
+        <w:t xml:space="preserve">Defended input at two layers: </w:t>
+      </w:r>
+      <w:r>
+        <w:rPr>
+          <w:rFonts w:ascii="Calibri" w:cs="Calibri" w:eastAsia="Calibri" w:hAnsi="Calibri"/>
+          <w:b/>
+          <w:bCs/>
+          <w:color w:val="111827"/>
+          <w:sz w:val="22"/>
+          <w:szCs w:val="22"/>
+        </w:rPr>
+        <w:t xml:space="preserve">reusable validation helpers</w:t>
+      </w:r>
+      <w:r>
+        <w:rPr>
+          <w:rFonts w:ascii="Calibri" w:cs="Calibri" w:eastAsia="Calibri" w:hAnsi="Calibri"/>
+          <w:b w:val="false"/>
+          <w:bCs w:val="false"/>
+          <w:color w:val="111827"/>
+          <w:sz w:val="22"/>
+          <w:szCs w:val="22"/>
+        </w:rPr>
+        <w:t xml:space="preserve"> in the CLI plus invariant checks inside the model.</w:t>
       </w:r>
     </w:p>
     <w:p>
@@ -968,7 +1077,7 @@
           <w:sz w:val="20"/>
           <w:szCs w:val="20"/>
         </w:rPr>
-        <w:t xml:space="preserve">github.com/fortunerohi27-crypto/atm-system</w:t>
+        <w:t xml:space="preserve">github.com/fortunerohi27-crypto/-atm-console-app</w:t>
       </w:r>
     </w:p>
     <w:p>

</xml_diff>